<commit_message>
ONE TIME PUSH BABY
</commit_message>
<xml_diff>
--- a/docs/AccessAI-Defense-Notes.docx
+++ b/docs/AccessAI-Defense-Notes.docx
@@ -61,7 +61,7 @@
           <w:sz w:val="22"/>
           <w:szCs w:val="22"/>
         </w:rPr>
-        <w:t xml:space="preserve">Written 12 October 2026, with measurements from that day.</w:t>
+        <w:t xml:space="preserve">Written 17 October 2026, with measurements from that day.</w:t>
       </w:r>
     </w:p>
     <w:p>
@@ -368,7 +368,7 @@
           </w:pPr>
           <w:hyperlink w:history="1" w:anchor="_Toc71">
             <w:r>
-              <w:t xml:space="preserve">3.3 How the game parts work</w:t>
+              <w:t xml:space="preserve">3.3 Progress, without the numbers</w:t>
             </w:r>
             <w:r>
               <w:tab/>
@@ -1774,7 +1774,7 @@
                 <w:sz w:val="19"/>
                 <w:szCs w:val="19"/>
               </w:rPr>
-              <w:t xml:space="preserve">Chat, SOS, Accel, sign language, push</w:t>
+              <w:t xml:space="preserve">Chat, SOS, Laya, sign language, push</w:t>
             </w:r>
           </w:p>
         </w:tc>
@@ -1923,7 +1923,7 @@
         <w:t xml:space="preserve">ratelimit</w:t>
       </w:r>
       <w:r>
-        <w:t xml:space="preserve"> against the real server: a burst of 130 requests lets 120 through and refuses the rest with "slow down" and a Retry-After; 40 more within the minute block the account (Retry-After ≈ 300 s); another account is unaffected throughout (7 of 7 checks).</w:t>
+        <w:t xml:space="preserve"> against the real server: a burst of 130 requests lets 120 through and refuses the rest with "slow down" and a Retry-After; 40 more within the minute block the account (Retry-After ≈ 300 s); another account is unaffected throughout, and all of it is one "limit hit" record in the activity log (8 of 8 checks).</w:t>
       </w:r>
     </w:p>
     <w:p>
@@ -5333,7 +5333,7 @@
         <w:t xml:space="preserve">play offline</w:t>
       </w:r>
       <w:r>
-        <w:t xml:space="preserve">, with no ads, no third-party player and no links that can disappear. 24 clips of 3 seconds stay small.</w:t>
+        <w:t xml:space="preserve">, with no ads, no third-party player and no links that can disappear.</w:t>
       </w:r>
     </w:p>
     <w:p>
@@ -5350,10 +5350,21 @@
           <w:b/>
           <w:bCs/>
         </w:rPr>
-        <w:t xml:space="preserve">No code to touch when a clip arrives</w:t>
-      </w:r>
-      <w:r>
-        <w:t xml:space="preserve">: the file replaces its empty placeholder of the same name, and the app finds it the next time it starts (a script run by the bundler lists the clips). A clip not recorded yet shows "Clip coming soon"; nothing breaks.</w:t>
+        <w:t xml:space="preserve">Made small without losing the hands</w:t>
+      </w:r>
+      <w:r>
+        <w:t xml:space="preserve">: the originals (1080p, about 20 Mbps, 12–20 s, about 900 MB in all) were compressed with ffmpeg to 720p H.264 at CRF 26, no sound: 0.75–1.41 MB each, about 25 MB in all. Frames were checked by eye, mid-movement too: face, hands and fingers stay clear. </w:t>
+      </w:r>
+      <w:r>
+        <w:rPr>
+          <w:rFonts w:ascii="Consolas" w:cs="Consolas" w:eastAsia="Consolas" w:hAnsi="Consolas"/>
+          <w:sz w:val="19"/>
+          <w:szCs w:val="19"/>
+        </w:rPr>
+        <w:t xml:space="preserve">learn-check</w:t>
+      </w:r>
+      <w:r>
+        <w:t xml:space="preserve"> refuses a missing clip or one over 10 MB.</w:t>
       </w:r>
     </w:p>
     <w:p>
@@ -5366,15 +5377,14 @@
         <w:spacing w:after="60" w:line="264"/>
       </w:pPr>
       <w:r>
-        <w:t xml:space="preserve">Earlier plan, dropped for the defense: YouTube links (the WLASL source videos for ASL). They needed the internet, could disappear or show ads, and FSL lessons on YouTube vary by region and teacher.</w:t>
-      </w:r>
-    </w:p>
-    <w:p>
-      <w:pPr>
-        <w:pStyle w:val="Heading3"/>
-      </w:pPr>
-      <w:r>
-        <w:t xml:space="preserve">Blind and low-vision learners</w:t>
+        <w:rPr>
+          <w:b/>
+          <w:bCs/>
+        </w:rPr>
+        <w:t xml:space="preserve">No code to touch for a new clip</w:t>
+      </w:r>
+      <w:r>
+        <w:t xml:space="preserve">: a script run by the bundler lists the clips when the app starts.</w:t>
       </w:r>
     </w:p>
     <w:p>
@@ -5387,17 +5397,15 @@
         <w:spacing w:after="60" w:line="264"/>
       </w:pPr>
       <w:r>
-        <w:t xml:space="preserve">Every sign has </w:t>
-      </w:r>
-      <w:r>
-        <w:rPr>
-          <w:b/>
-          <w:bCs/>
-        </w:rPr>
-        <w:t xml:space="preserve">spoken step-by-step instructions</w:t>
-      </w:r>
-      <w:r>
-        <w:t xml:space="preserve"> ("Make a fist with your right hand. Rub it around in a circle on your chest."), stored with the sign. They describe the hands only and never say the word, so a quiz can read them out.</w:t>
+        <w:t xml:space="preserve">Earlier plan, dropped for the defense: YouTube links (the WLASL source videos for ASL). They needed the internet, could disappear or show ads, and FSL lessons on YouTube vary by region and teacher.</w:t>
+      </w:r>
+    </w:p>
+    <w:p>
+      <w:pPr>
+        <w:pStyle w:val="Heading3"/>
+      </w:pPr>
+      <w:r>
+        <w:t xml:space="preserve">Blind and low-vision learners</w:t>
       </w:r>
     </w:p>
     <w:p>
@@ -5410,7 +5418,17 @@
         <w:spacing w:after="60" w:line="264"/>
       </w:pPr>
       <w:r>
-        <w:t xml:space="preserve">With TalkBack or VoiceOver on, or with the Blind / low-vision profile, Learn tells signs in steps instead of only showing them: the steps are read (aloud by themselves for the profile), quizzes become "What sign do these steps make?" with the choices read out, and questions that need seeing (pick the video, match) are left out.</w:t>
+        <w:t xml:space="preserve">Every sign has </w:t>
+      </w:r>
+      <w:r>
+        <w:rPr>
+          <w:b/>
+          <w:bCs/>
+        </w:rPr>
+        <w:t xml:space="preserve">spoken step-by-step instructions</w:t>
+      </w:r>
+      <w:r>
+        <w:t xml:space="preserve"> ("Make a fist with your right hand. Rub it around in a circle on your chest."), stored with the sign. They describe the hands only and never say the word, so a quiz can read them out.</w:t>
       </w:r>
     </w:p>
     <w:p>
@@ -5423,6 +5441,19 @@
         <w:spacing w:after="60" w:line="264"/>
       </w:pPr>
       <w:r>
+        <w:t xml:space="preserve">With TalkBack or VoiceOver on, or with the Blind / low-vision profile, Learn tells signs in steps instead of only showing them: the steps are read (aloud by themselves for the profile), quizzes become "What sign do these steps make?" with the choices read out, and questions that need seeing (pick the video, match) are left out.</w:t>
+      </w:r>
+    </w:p>
+    <w:p>
+      <w:pPr>
+        <w:pStyle w:val="ListParagraph"/>
+        <w:numPr>
+          <w:ilvl w:val="0"/>
+          <w:numId w:val="2"/>
+        </w:numPr>
+        <w:spacing w:after="60" w:line="264"/>
+      </w:pPr>
+      <w:r>
         <w:t xml:space="preserve">Every question and button has a label and a role; the screen reader moves to each new question by itself; a Continue button at the top of Learn starts the next lesson without swiping past everything. A blind learner can finish the real levels without seeing the screen.</w:t>
       </w:r>
     </w:p>
@@ -5432,9 +5463,17 @@
       </w:pPr>
       <w:bookmarkStart w:name="_Toc71" w:id="71"/>
       <w:r>
-        <w:t xml:space="preserve">3.3 How the game parts work</w:t>
+        <w:t xml:space="preserve">3.3 Progress, without the numbers</w:t>
       </w:r>
       <w:bookmarkEnd w:id="71"/>
+    </w:p>
+    <w:p>
+      <w:pPr>
+        <w:spacing w:after="120" w:line="276"/>
+      </w:pPr>
+      <w:r>
+        <w:t xml:space="preserve">XP, levels, streaks, the daily goal, hearts and badges were removed on 2026-10-17: fewer numbers on screen, and a mistake never costs anything or locks a lesson. What is left:</w:t>
+      </w:r>
     </w:p>
     <w:tbl>
       <w:tblPr>
@@ -5547,7 +5586,7 @@
                 <w:sz w:val="19"/>
                 <w:szCs w:val="19"/>
               </w:rPr>
-              <w:t xml:space="preserve">XP</w:t>
+              <w:t xml:space="preserve">Unlocks</w:t>
             </w:r>
           </w:p>
         </w:tc>
@@ -5576,7 +5615,7 @@
                 <w:sz w:val="19"/>
                 <w:szCs w:val="19"/>
               </w:rPr>
-              <w:t xml:space="preserve">Lesson 10, review 5, no wrong answers +5, each sign done with the camera +3; at most 30 per lesson (the server refuses more)</w:t>
+              <w:t xml:space="preserve">Each lesson opens the next; a review closes each unit</w:t>
             </w:r>
           </w:p>
         </w:tc>
@@ -5607,7 +5646,7 @@
                 <w:sz w:val="19"/>
                 <w:szCs w:val="19"/>
               </w:rPr>
-              <w:t xml:space="preserve">Levels</w:t>
+              <w:t xml:space="preserve">Done</w:t>
             </w:r>
           </w:p>
         </w:tc>
@@ -5636,7 +5675,7 @@
                 <w:sz w:val="19"/>
                 <w:szCs w:val="19"/>
               </w:rPr>
-              <w:t xml:space="preserve">Level L needs 25·(L−1)·L XP: level 2 at 50, 3 at 150, 5 at 500, 10 at 2,250 — each level a little longer than the last</w:t>
+              <w:t xml:space="preserve">Which lessons and levels are finished, and a short "done" screen after each lesson</w:t>
             </w:r>
           </w:p>
         </w:tc>
@@ -5667,7 +5706,7 @@
                 <w:sz w:val="19"/>
                 <w:szCs w:val="19"/>
               </w:rPr>
-              <w:t xml:space="preserve">Streak</w:t>
+              <w:t xml:space="preserve">Leaderboard</w:t>
             </w:r>
           </w:p>
         </w:tc>
@@ -5696,7 +5735,7 @@
                 <w:sz w:val="19"/>
                 <w:szCs w:val="19"/>
               </w:rPr>
-              <w:t xml:space="preserve">Days in a row with at least one lesson, in Philippine time; today still counts as kept until it ends</w:t>
+              <w:t xml:space="preserve">How many different lessons you and your friends finished this week (from Monday 00:00, Manila); replaying one doesn't count twice</w:t>
             </w:r>
           </w:p>
         </w:tc>
@@ -5727,7 +5766,7 @@
                 <w:sz w:val="19"/>
                 <w:szCs w:val="19"/>
               </w:rPr>
-              <w:t xml:space="preserve">Daily goal</w:t>
+              <w:t xml:space="preserve">Practice and Credits</w:t>
             </w:r>
           </w:p>
         </w:tc>
@@ -5756,247 +5795,7 @@
                 <w:sz w:val="19"/>
                 <w:szCs w:val="19"/>
               </w:rPr>
-              <w:t xml:space="preserve">10, 20, 30 or 50 XP (20 by default)</w:t>
-            </w:r>
-          </w:p>
-        </w:tc>
-      </w:tr>
-      <w:tr>
-        <w:tc>
-          <w:tcPr>
-            <w:tcW w:type="dxa" w:w="1734"/>
-            <w:tcBorders>
-              <w:top w:val="single" w:color="C9C4E8" w:sz="4"/>
-              <w:left w:val="single" w:color="C9C4E8" w:sz="4"/>
-              <w:bottom w:val="single" w:color="C9C4E8" w:sz="4"/>
-              <w:right w:val="single" w:color="C9C4E8" w:sz="4"/>
-            </w:tcBorders>
-            <w:tcMar>
-              <w:top w:type="dxa" w:w="60"/>
-              <w:left w:type="dxa" w:w="100"/>
-              <w:bottom w:type="dxa" w:w="60"/>
-              <w:right w:type="dxa" w:w="100"/>
-            </w:tcMar>
-          </w:tcPr>
-          <w:p>
-            <w:pPr>
-              <w:spacing w:after="40"/>
-            </w:pPr>
-            <w:r>
-              <w:rPr>
-                <w:sz w:val="19"/>
-                <w:szCs w:val="19"/>
-              </w:rPr>
-              <w:t xml:space="preserve">Hearts</w:t>
-            </w:r>
-          </w:p>
-        </w:tc>
-        <w:tc>
-          <w:tcPr>
-            <w:tcW w:type="dxa" w:w="7904"/>
-            <w:tcBorders>
-              <w:top w:val="single" w:color="C9C4E8" w:sz="4"/>
-              <w:left w:val="single" w:color="C9C4E8" w:sz="4"/>
-              <w:bottom w:val="single" w:color="C9C4E8" w:sz="4"/>
-              <w:right w:val="single" w:color="C9C4E8" w:sz="4"/>
-            </w:tcBorders>
-            <w:tcMar>
-              <w:top w:type="dxa" w:w="60"/>
-              <w:left w:type="dxa" w:w="100"/>
-              <w:bottom w:type="dxa" w:w="60"/>
-              <w:right w:type="dxa" w:w="100"/>
-            </w:tcMar>
-          </w:tcPr>
-          <w:p>
-            <w:pPr>
-              <w:spacing w:after="40"/>
-            </w:pPr>
-            <w:r>
-              <w:rPr>
-                <w:sz w:val="19"/>
-                <w:szCs w:val="19"/>
-              </w:rPr>
-              <w:t xml:space="preserve">5; a wrong quiz answer costs one; one back every 30 minutes; a unit review fills them; the camera never costs a heart; at 0 only reviews and practice are open</w:t>
-            </w:r>
-          </w:p>
-        </w:tc>
-      </w:tr>
-      <w:tr>
-        <w:tc>
-          <w:tcPr>
-            <w:tcW w:type="dxa" w:w="1734"/>
-            <w:tcBorders>
-              <w:top w:val="single" w:color="C9C4E8" w:sz="4"/>
-              <w:left w:val="single" w:color="C9C4E8" w:sz="4"/>
-              <w:bottom w:val="single" w:color="C9C4E8" w:sz="4"/>
-              <w:right w:val="single" w:color="C9C4E8" w:sz="4"/>
-            </w:tcBorders>
-            <w:tcMar>
-              <w:top w:type="dxa" w:w="60"/>
-              <w:left w:type="dxa" w:w="100"/>
-              <w:bottom w:type="dxa" w:w="60"/>
-              <w:right w:type="dxa" w:w="100"/>
-            </w:tcMar>
-          </w:tcPr>
-          <w:p>
-            <w:pPr>
-              <w:spacing w:after="40"/>
-            </w:pPr>
-            <w:r>
-              <w:rPr>
-                <w:sz w:val="19"/>
-                <w:szCs w:val="19"/>
-              </w:rPr>
-              <w:t xml:space="preserve">Unlocks</w:t>
-            </w:r>
-          </w:p>
-        </w:tc>
-        <w:tc>
-          <w:tcPr>
-            <w:tcW w:type="dxa" w:w="7904"/>
-            <w:tcBorders>
-              <w:top w:val="single" w:color="C9C4E8" w:sz="4"/>
-              <w:left w:val="single" w:color="C9C4E8" w:sz="4"/>
-              <w:bottom w:val="single" w:color="C9C4E8" w:sz="4"/>
-              <w:right w:val="single" w:color="C9C4E8" w:sz="4"/>
-            </w:tcBorders>
-            <w:tcMar>
-              <w:top w:type="dxa" w:w="60"/>
-              <w:left w:type="dxa" w:w="100"/>
-              <w:bottom w:type="dxa" w:w="60"/>
-              <w:right w:type="dxa" w:w="100"/>
-            </w:tcMar>
-          </w:tcPr>
-          <w:p>
-            <w:pPr>
-              <w:spacing w:after="40"/>
-            </w:pPr>
-            <w:r>
-              <w:rPr>
-                <w:sz w:val="19"/>
-                <w:szCs w:val="19"/>
-              </w:rPr>
-              <w:t xml:space="preserve">Each lesson opens the next; a review closes each unit</w:t>
-            </w:r>
-          </w:p>
-        </w:tc>
-      </w:tr>
-      <w:tr>
-        <w:tc>
-          <w:tcPr>
-            <w:tcW w:type="dxa" w:w="1734"/>
-            <w:tcBorders>
-              <w:top w:val="single" w:color="C9C4E8" w:sz="4"/>
-              <w:left w:val="single" w:color="C9C4E8" w:sz="4"/>
-              <w:bottom w:val="single" w:color="C9C4E8" w:sz="4"/>
-              <w:right w:val="single" w:color="C9C4E8" w:sz="4"/>
-            </w:tcBorders>
-            <w:tcMar>
-              <w:top w:type="dxa" w:w="60"/>
-              <w:left w:type="dxa" w:w="100"/>
-              <w:bottom w:type="dxa" w:w="60"/>
-              <w:right w:type="dxa" w:w="100"/>
-            </w:tcMar>
-          </w:tcPr>
-          <w:p>
-            <w:pPr>
-              <w:spacing w:after="40"/>
-            </w:pPr>
-            <w:r>
-              <w:rPr>
-                <w:sz w:val="19"/>
-                <w:szCs w:val="19"/>
-              </w:rPr>
-              <w:t xml:space="preserve">Badges</w:t>
-            </w:r>
-          </w:p>
-        </w:tc>
-        <w:tc>
-          <w:tcPr>
-            <w:tcW w:type="dxa" w:w="7904"/>
-            <w:tcBorders>
-              <w:top w:val="single" w:color="C9C4E8" w:sz="4"/>
-              <w:left w:val="single" w:color="C9C4E8" w:sz="4"/>
-              <w:bottom w:val="single" w:color="C9C4E8" w:sz="4"/>
-              <w:right w:val="single" w:color="C9C4E8" w:sz="4"/>
-            </w:tcBorders>
-            <w:tcMar>
-              <w:top w:type="dxa" w:w="60"/>
-              <w:left w:type="dxa" w:w="100"/>
-              <w:bottom w:type="dxa" w:w="60"/>
-              <w:right w:type="dxa" w:w="100"/>
-            </w:tcMar>
-          </w:tcPr>
-          <w:p>
-            <w:pPr>
-              <w:spacing w:after="40"/>
-            </w:pPr>
-            <w:r>
-              <w:rPr>
-                <w:sz w:val="19"/>
-                <w:szCs w:val="19"/>
-              </w:rPr>
-              <w:t xml:space="preserve">First lesson, first camera sign, perfect lesson, 3/7/30 days in a row, a unit done, a course done, level 5 and 10</w:t>
-            </w:r>
-          </w:p>
-        </w:tc>
-      </w:tr>
-      <w:tr>
-        <w:tc>
-          <w:tcPr>
-            <w:tcW w:type="dxa" w:w="1734"/>
-            <w:tcBorders>
-              <w:top w:val="single" w:color="C9C4E8" w:sz="4"/>
-              <w:left w:val="single" w:color="C9C4E8" w:sz="4"/>
-              <w:bottom w:val="single" w:color="C9C4E8" w:sz="4"/>
-              <w:right w:val="single" w:color="C9C4E8" w:sz="4"/>
-            </w:tcBorders>
-            <w:tcMar>
-              <w:top w:type="dxa" w:w="60"/>
-              <w:left w:type="dxa" w:w="100"/>
-              <w:bottom w:type="dxa" w:w="60"/>
-              <w:right w:type="dxa" w:w="100"/>
-            </w:tcMar>
-          </w:tcPr>
-          <w:p>
-            <w:pPr>
-              <w:spacing w:after="40"/>
-            </w:pPr>
-            <w:r>
-              <w:rPr>
-                <w:sz w:val="19"/>
-                <w:szCs w:val="19"/>
-              </w:rPr>
-              <w:t xml:space="preserve">Leaderboard</w:t>
-            </w:r>
-          </w:p>
-        </w:tc>
-        <w:tc>
-          <w:tcPr>
-            <w:tcW w:type="dxa" w:w="7904"/>
-            <w:tcBorders>
-              <w:top w:val="single" w:color="C9C4E8" w:sz="4"/>
-              <w:left w:val="single" w:color="C9C4E8" w:sz="4"/>
-              <w:bottom w:val="single" w:color="C9C4E8" w:sz="4"/>
-              <w:right w:val="single" w:color="C9C4E8" w:sz="4"/>
-            </w:tcBorders>
-            <w:tcMar>
-              <w:top w:type="dxa" w:w="60"/>
-              <w:left w:type="dxa" w:w="100"/>
-              <w:bottom w:type="dxa" w:w="60"/>
-              <w:right w:type="dxa" w:w="100"/>
-            </w:tcMar>
-          </w:tcPr>
-          <w:p>
-            <w:pPr>
-              <w:spacing w:after="40"/>
-            </w:pPr>
-            <w:r>
-              <w:rPr>
-                <w:sz w:val="19"/>
-                <w:szCs w:val="19"/>
-              </w:rPr>
-              <w:t xml:space="preserve">This week's XP (from Monday 00:00, Manila) for you and your friends only</w:t>
+              <w:t xml:space="preserve">Kept as they were</w:t>
             </w:r>
           </w:p>
         </w:tc>
@@ -6043,7 +5842,7 @@
         <w:spacing w:after="60" w:line="264"/>
       </w:pPr>
       <w:r>
-        <w:t xml:space="preserve">The clips are being recorded by the team; until each arrives, its sign shows "Clip coming soon" (the steps and the camera check still work).</w:t>
+        <w:t xml:space="preserve">Clips need the next app build to play in the development build (the video player is a native part; it already works in Expo Go).</w:t>
       </w:r>
     </w:p>
     <w:p>
@@ -6056,7 +5855,7 @@
         <w:spacing w:after="60" w:line="264"/>
       </w:pPr>
       <w:r>
-        <w:t xml:space="preserve">Clips need the next app build (the video player is a native part; it already works in Expo Go).</w:t>
+        <w:t xml:space="preserve">The spoken steps were written from how the signs are usually made and are checked by the teammate recording each clip.</w:t>
       </w:r>
     </w:p>
     <w:p>
@@ -6069,7 +5868,7 @@
         <w:spacing w:after="60" w:line="264"/>
       </w:pPr>
       <w:r>
-        <w:t xml:space="preserve">The spoken steps were written from how the signs are usually made and are checked by the teammate recording each clip.</w:t>
+        <w:t xml:space="preserve">The camera check needs the laptop's sign reader and the internet; ASL checks are lenient by design, and the new ASL model's accuracy is not measured yet.</w:t>
       </w:r>
     </w:p>
     <w:p>
@@ -6082,19 +5881,6 @@
         <w:spacing w:after="60" w:line="264"/>
       </w:pPr>
       <w:r>
-        <w:t xml:space="preserve">The camera check needs the laptop's sign reader and the internet; ASL checks are lenient by design, and the new ASL model's accuracy is not measured yet.</w:t>
-      </w:r>
-    </w:p>
-    <w:p>
-      <w:pPr>
-        <w:pStyle w:val="ListParagraph"/>
-        <w:numPr>
-          <w:ilvl w:val="0"/>
-          <w:numId w:val="2"/>
-        </w:numPr>
-        <w:spacing w:after="60" w:line="264"/>
-      </w:pPr>
-      <w:r>
         <w:t xml:space="preserve">No letters (fingerspelling) yet: there is no letters model.</w:t>
       </w:r>
     </w:p>
@@ -6260,7 +6046,7 @@
         <w:t xml:space="preserve">A: </w:t>
       </w:r>
       <w:r>
-        <w:t xml:space="preserve">Cost and privacy: no paid API, and no voice command or sign video leaves our machine. The price is that the laptop must be on; Accel's phone rules and everything offline keep working without it.</w:t>
+        <w:t xml:space="preserve">Cost and privacy: no paid API, and no voice command or sign video leaves our machine. The price is that the laptop must be on; Laya's phone rules and everything offline keep working without it.</w:t>
       </w:r>
     </w:p>
     <w:p>
@@ -6436,7 +6222,7 @@
         <w:t xml:space="preserve">A: </w:t>
       </w:r>
       <w:r>
-        <w:t xml:space="preserve">Account details, friends, chats, SOS events, emergency contacts, backed-up conversations, Learn progress. Deleting the account erases all of it after a 15-day grace period (cancel by logging in). Videos and voice audio are never stored. Consent (terms version, PWD declaration time) is recorded at sign-up.</w:t>
+        <w:t xml:space="preserve">Account details, friends, chats, SOS events, emergency contacts, backed-up conversations, Learn progress, and login and activity records (kept 90 days, then deleted by MongoDB itself). Deleting the account erases all of it after a 15-day grace period (cancel by logging in). Videos and voice audio are never stored. Consent (terms version, PWD declaration time) is recorded at sign-up, and again when someone agrees to updated Terms.</w:t>
       </w:r>
     </w:p>
     <w:p>
@@ -6456,6 +6242,78 @@
           <w:b/>
           <w:bCs/>
         </w:rPr>
+        <w:t xml:space="preserve">What can your admins see?</w:t>
+      </w:r>
+    </w:p>
+    <w:p>
+      <w:pPr>
+        <w:spacing w:after="120" w:line="276"/>
+      </w:pPr>
+      <w:r>
+        <w:rPr>
+          <w:b/>
+          <w:bCs/>
+          <w:color w:val="5B4BD6"/>
+        </w:rPr>
+        <w:t xml:space="preserve">A: </w:t>
+      </w:r>
+      <w:r>
+        <w:t xml:space="preserve">Name, email, account type and status; login and activity records (when, phone type, app version, network address, limits hit); and SOS records — when, test or real, how many friends were alerted, who answered and when, and how it ended. Never the place, the location or the message: the admin answer is built from a fixed list of fields that leaves them out, and an end-to-end check looks at every key. Every time an admin opens someone's records, that is logged too.</w:t>
+      </w:r>
+    </w:p>
+    <w:p>
+      <w:pPr>
+        <w:spacing w:after="40" w:before="120"/>
+      </w:pPr>
+      <w:r>
+        <w:rPr>
+          <w:b/>
+          <w:bCs/>
+          <w:color w:val="5B4BD6"/>
+        </w:rPr>
+        <w:t xml:space="preserve">Q: </w:t>
+      </w:r>
+      <w:r>
+        <w:rPr>
+          <w:b/>
+          <w:bCs/>
+        </w:rPr>
+        <w:t xml:space="preserve">What happens to someone who spams or sends fake SOS alerts?</w:t>
+      </w:r>
+    </w:p>
+    <w:p>
+      <w:pPr>
+        <w:spacing w:after="120" w:line="276"/>
+      </w:pPr>
+      <w:r>
+        <w:rPr>
+          <w:b/>
+          <w:bCs/>
+          <w:color w:val="5B4BD6"/>
+        </w:rPr>
+        <w:t xml:space="preserve">A: </w:t>
+      </w:r>
+      <w:r>
+        <w:t xml:space="preserve">An admin can suspend the account for 1, 7 or 30 days (the person sees until when and why) or, as a super admin, delete it in 30 days (locked at once, only an admin can undo it). Either way the account is signed out everywhere at once and disappears from friends' lists. "Needs a look" points admins to warning signs, but nothing is blocked automatically.</w:t>
+      </w:r>
+    </w:p>
+    <w:p>
+      <w:pPr>
+        <w:spacing w:after="40" w:before="120"/>
+      </w:pPr>
+      <w:r>
+        <w:rPr>
+          <w:b/>
+          <w:bCs/>
+          <w:color w:val="5B4BD6"/>
+        </w:rPr>
+        <w:t xml:space="preserve">Q: </w:t>
+      </w:r>
+      <w:r>
+        <w:rPr>
+          <w:b/>
+          <w:bCs/>
+        </w:rPr>
         <w:t xml:space="preserve">Could the AI be tricked into doing something?</w:t>
       </w:r>
     </w:p>
@@ -6590,7 +6448,7 @@
         <w:t xml:space="preserve">A: </w:t>
       </w:r>
       <w:r>
-        <w:t xml:space="preserve">Automatic checks, all passing on 13 October 2026: 130 end-to-end checks against the running server and real database (errors and injection, accounts, staying logged in, Google-only accounts, SOS, push, AI, scale, Learn, rate limits) using throwaway accounts; 117 Accel rule sentences; 67 Learn checks (only words the models know, every sign's steps and clip, the locked levels, lessons, XP, hearts); 16 checks that two accounts on one phone never see each other's conversations; 15 token-bucket checks on a fake clock; the sign pipeline check (all 96 FSL test recordings read the same as the tester, and the new ASL model reads all 131 older recordings without an error); the colour contrast of every palette; TypeScript, lint and a full Android bundle. Plus testing on real phones (see HANDOFF.md).</w:t>
+        <w:t xml:space="preserve">Automatic checks, all passing on 17 October 2026: 215 end-to-end checks against the running server and real database (errors and injection, accounts, staying logged in, Google-only accounts, activity records, logout, updated Terms, the admin panel's suspend / delete in 30 days / SOS records / "Needs a look", SOS, push, AI, scale, Learn, rate limits) using throwaway accounts; 222 Laya rule checks (English and Filipino, "Hey Laya" with its greeting, every guide example understood offline); 56 Learn checks (only words the models know, every sign's steps, every clip recorded and at most 10 MB, the locked levels, lessons); 16 checks that two accounts on one phone never see each other's conversations; 15 token-bucket checks on a fake clock; 16 profile checks (presets, switching needs, saved settings moving from Accel to Laya); 16 speech checks (new speech cuts off the old); the 73 Laya actions matching between the app and the AI service; the AI picking the right action for 58 of 66 sentences it has never seen; the colour contrast of every palette; TypeScript and lint for the app and the admin website. Run on 13 October and unchanged since: the sign pipeline check (all 96 FSL test recordings read the same as the tester, and the new ASL model reads all 131 older recordings without an error) and a full Android bundle. The phone tests still to do are listed in HANDOFF.md.</w:t>
       </w:r>
     </w:p>
     <w:p>
@@ -6656,7 +6514,7 @@
           <w:b/>
           <w:bCs/>
         </w:rPr>
-        <w:t xml:space="preserve">Why use both rules and an LLM for Accel?</w:t>
+        <w:t xml:space="preserve">Why use both rules and an LLM for Laya?</w:t>
       </w:r>
     </w:p>
     <w:p>

</xml_diff>